<commit_message>
Respond to EASI v2 econometric audit
</commit_message>
<xml_diff>
--- a/cctv_easi_demand/paper_v2/manuscript_food_policy_v2.docx
+++ b/cctv_easi_demand/paper_v2/manuscript_food_policy_v2.docx
@@ -11,7 +11,7 @@
           <w:b/>
           <w:sz w:val="28"/>
         </w:rPr>
-        <w:t>Food demand and the welfare cost of food price changes in China: evidence from a curvature-constrained censored EASI system on high-frequency household scanner data</w:t>
+        <w:t>Monthly food purchase demand and food price changes in China: evidence from a censored EASI system on high-frequency household scanner data</w:t>
       </w:r>
     </w:p>
     <w:p>
@@ -41,7 +41,7 @@
     </w:p>
     <w:p>
       <w:r>
-        <w:t>We estimate a complete food demand system for urban China on a monthly panel of 27638 households (583668 household-month observations, 24 provinces, 2020–2022) built from continuous scanner records. Prices are measured from external provincial market series with fixed 2021 baskets, eliminating unit-value endogeneity. We estimate an Exact Affine Stone Index (EASI) demand system with a two-step censored specification, correlated random effects, and month and year fixed effects. The participation-adjusted system is already essentially regular—its largest Slutsky eigenvalue is economically negligible—so we report the unconstrained elasticities as primary and show that imposing Slutsky negativity globally through a Cholesky reparameterization of the price-coefficient matrix at two support points leaves the qualitative pattern intact while, as expected, tightening only the least-identified small-share elasticities. All nine own-price elasticities are negative and economically plausible. Exploiting the daily transaction timestamps, we add purchase-cycle exclusion variables to the participation stage that separate the inventory-cycle and corner-solution mechanisms behind monthly zero purchases of storable goods; this sharpens the participation fit and yields a plausible near-unit-elastic staple response in place of the implausibly large estimate obtained when purchase timing is left in the price coefficient. Inference combines household- and province-clustered standard errors, a studentized province-level score multiplier bootstrap with Webb weights, and a household pairs cluster bootstrap over the full two-step pipeline. Using the estimated Hicksian elasticities we compute the compensating variation of the 2020–2022 food price changes. Because the period is dominated by the post-African-swine-fever reversal of pork prices against broad increases elsewhere, the incidence is progressive: net losses rise monotonically with income, from roughly zero for the poorest quintile—whose substitution gain nearly cancels its first-order loss—to the largest loss for the richest. The results provide elasticity and welfare inputs for food price policy in China.</w:t>
+        <w:t>We estimate a complete monthly food purchase-demand system for urban China on a panel of 27638 households (583668 household-month observations, 24 provinces, 2020–2022) built from continuous scanner records. Prices are measured from external provincial market series with fixed 2021 baskets, avoiding household unit-value endogeneity. We estimate an Exact Affine Stone Index (EASI) demand system with a two-step censored specification, correlated random effects, and month and year fixed effects. The participation-adjusted system is interpreted as a purchase system: monthly zeroes often reflect shopping timing and inventory cycles rather than literal zero consumption. We therefore report Marshallian purchase elasticities as the primary results, treat latent curvature checks as regularity diagnostics, and report welfare calculations only as exploratory potential-demand approximations. All nine own-price elasticities are negative and economically plausible. Exploiting the daily transaction timestamps, we add purchase-cycle exclusion variables to the participation stage that separate the inventory-cycle and corner-solution mechanisms behind monthly zero purchases of storable goods; this sharpens the participation fit and yields a plausible near-unit-elastic staple response in place of the implausibly large estimate obtained when purchase timing is left in the price coefficient. Inference combines household- and province-clustered standard errors, a studentized province-level score multiplier bootstrap with Webb weights, and a household pairs cluster bootstrap over the full two-step pipeline, plus audit-response diagnostics for expenditure control functions, purchase-cycle exclusion restrictions, prediction clipping, and leave-one-province-out price sensitivity. The results provide purchase-elasticity inputs for food price policy in China while making clear which welfare and structural-consumption claims require stronger identifying assumptions.</w:t>
       </w:r>
     </w:p>
     <w:p>
@@ -2237,7 +2237,7 @@
     </w:p>
     <w:p>
       <w:r>
-        <w:t>Unconditional elasticities are computed numerically by perturbing each price (or total expenditure) by one percent and re-solving the full observed-share prediction (3), including the re-evaluation of participation probabilities—so both the intensive and extensive margins respond. Hicksian elasticities follow from the Slutsky equation</w:t>
+        <w:t>Unconditional elasticities are computed numerically by perturbing each price (or total expenditure) by one percent and re-solving the full observed-share prediction (3), including the re-evaluation of participation probabilities—so both the intensive and extensive purchase margins respond. The compensated matrix reported below is a Slutsky-style diagnostic constructed from</w:t>
       </w:r>
     </w:p>
     <w:p>
@@ -2414,12 +2414,12 @@
     </w:p>
     <w:p>
       <w:r>
-        <w:t>The elasticity experiment holds the household Mundlak means at their base values while prices, participation probabilities, and shares respond, so the estimates are short-run responses with the household's long-run component fixed.</w:t>
+        <w:t>The elasticity experiment holds the household Mundlak means at their base values while prices, participation probabilities, and shares respond, so the estimates are short-run monthly purchase responses with the household's long-run component fixed. Because the Shonkwiler-Yen participation stage is not itself a globally integrable corner-demand model, the unconditional compensated matrix is not interpreted as a strict Hicksian demand system.</w:t>
       </w:r>
     </w:p>
     <w:p>
       <w:r>
-        <w:t>Inference proceeds at three levels. Analytic sandwich standard errors—with the CR1 small-sample correction—are clustered by household (primary) and by province; they treat the first-stage probits, the Stone weights, and the estimated error covariance as known, and are therefore reported as two-step-naive reference values only. Price-coefficient inference is additionally checked with a studentized score-based cluster multiplier bootstrap at the province level using Webb six-point weights: province score blocks are perturbed and each draw is studentized by its own draw-specific cluster-robust standard error, so the reference distribution is of t-statistics—the studentization that gives multiplier bootstraps their asymptotic refinement with a modest number (24) of heterogeneous clusters. This is a score (multiplier) bootstrap, not a restricted wild cluster bootstrap with null-imposed re-estimation. Finally, all elasticity and welfare confidence intervals—and all significance statements in the text—come from a 210-replication household pairs cluster bootstrap that resamples households with replacement (implemented as frequency weights) and re-executes the entire pipeline—Stone weights, probits, constrained GLS, and elasticity computation—in every replication, thereby carrying the two-step and generated-regressor uncertainty that the analytic formulas omit.</w:t>
+        <w:t>Inference proceeds at three levels. Analytic sandwich standard errors—with the CR1 small-sample correction— are clustered by household and by province; they treat the first-stage probits, the Stone weights, and the estimated error covariance as known, and are therefore reported as two-step-naive reference values only. Price-coefficient inference is additionally checked with a studentized score-based cluster multiplier bootstrap at the province level using Webb six-point weights: province score blocks are perturbed and each draw is studentized by its own draw-specific cluster-robust standard error, so the reference distribution is of t-statistics—the studentization that gives multiplier bootstraps their asymptotic refinement with a modest number (24) of heterogeneous clusters. This is a score (multiplier) bootstrap, not a restricted wild cluster bootstrap with null-imposed re-estimation. Household pairs bootstrap intervals are retained as composition-and-two-step uncertainty checks, but price elasticities are interpreted against the province-level price variation and the 24-cluster sensitivity diagnostics reported in the audit appendix.</w:t>
       </w:r>
     </w:p>
     <w:p>
@@ -2531,7 +2531,12 @@
     </w:p>
     <w:p>
       <w:r>
-        <w:t>Because the storable groups—staples above all—carry the most lumpy, infrequently purchased monthly baskets, we probe the participation treatment directly. The purchase-cycle exclusion variables are the substantive lever: dropping them inflates the staple own-price elasticity by roughly half and leaves the staple and dairy participation probits poorly fit, whereas including them delivers the plausible near-unit-elastic staple response reported above and raises every participation pseudo-R². Following the infrequency-of-purchase literature (Cragg, 1971; Deaton and Irish, 1984; Blundell and Meghir, 1987), we confirm the interpretation with a frequency-gradient diagnostic: aggregating the data from monthly to quarterly and annual windows collapses the storable groups' zero rates while leaving perishables' roughly unchanged. The staple purchase rate rises from 0.59 at monthly frequency to 0.86 quarterly and 0.96 annually, so the purchase-timing margin mechanically shrinks as the window widens. The staple own-price elasticity is furthermore stable under a basket-completeness screen dropping thin-recording household-months (-1.08); winsorizing group budget shares at 2.5 percent (-1.09); a Cragg double-hurdle that treats never-buyers as structural zeros (-0.91). These checks confirm that the main elasticities are not artifacts of thin recording, share outliers, or the corner-versus-inventory ambiguity of monthly zero purchases.</w:t>
+        <w:t>Because the storable groups—staples above all—carry the most lumpy, infrequently purchased monthly baskets, we probe the participation treatment directly. The purchase-cycle exclusion variables are the substantive lever: dropping them inflates the staple own-price elasticity by roughly half and leaves the staple and dairy participation probits poorly fit, whereas including them delivers the plausible near-unit-elastic staple response reported above and raises every participation pseudo-R². Following the infrequency-of-purchase literature (Cragg, 1971; Deaton and Irish, 1984; Blundell and Meghir, 1987), we confirm the interpretation with reduced-form frequency diagnostics rather than a degenerate quarterly or annual full SY system: aggregating the data from monthly to quarterly and annual windows collapses the storable groups' zero rates while leaving perishables' roughly unchanged, and the 28-day diagnostic is rebuilt on a complete household-window-group zero grid. The staple purchase rate rises from 0.59 at monthly frequency to 0.86 quarterly and 0.96 annually, so the purchase-timing margin mechanically shrinks as the window widens. The staple own-price elasticity is furthermore stable under a basket-completeness screen dropping thin-recording household-months (-1.08); winsorizing group budget shares at 2.5 percent (-1.09). These checks confirm that the main elasticities are not artifacts of thin recording, share outliers, or the corner-versus-inventory ambiguity of monthly zero purchases.</w:t>
+      </w:r>
+    </w:p>
+    <w:p>
+      <w:r>
+        <w:t>The audit appendix reports diagnostics that bound the interpretation of the monthly purchase system: the expenditure control-function sensitivity changes own-price elasticities by at most 0.15; purchase-cycle variables are jointly significant in 9 auxiliary share equations, so they are treated as identifying exclusions only with caution; the largest raw negative predicted-share rate is 1.9 percent; the unconditional Slutsky asymmetry diagnostic is 0.065. These results are why the paper frames the main contribution as externally priced monthly purchase elasticities rather than a fully structural consumption-welfare model.</w:t>
       </w:r>
     </w:p>
     <w:p>
@@ -2543,12 +2548,12 @@
           <w:rFonts w:ascii="Times New Roman" w:hAnsi="Times New Roman"/>
           <w:color w:val="000000"/>
         </w:rPr>
-        <w:t>6. The welfare incidence of the 2020–2022 food price changes</w:t>
+        <w:t>6. Exploratory welfare incidence of the 2020–2022 food price changes</w:t>
       </w:r>
     </w:p>
     <w:p>
       <w:r>
-        <w:t>We convert the estimated system into money-metric welfare effects with the second-order approximation to compensating variation, evaluated with income-group-specific budget shares and Hicksian elasticities:</w:t>
+        <w:t>As an exploratory calculation, we convert the latent/potential demand system into money-metric effects with the second-order approximation to compensating variation, evaluated with income-group-specific budget shares and the compensated diagnostic matrix. Because the unconditional purchase system combines participation and conditional shares outside a single globally integrable corner-demand model, these numbers are not used as strict welfare estimates:</w:t>
       </w:r>
     </w:p>
     <w:p>
@@ -3035,7 +3040,7 @@
     </w:p>
     <w:p>
       <w:r>
-        <w:t>We provide a theoretically coherent, externally priced, and fully inferenced food demand system for urban China at monthly frequency, and use it to quantify the distributional welfare incidence of the 2020–2022 food price movements. Methodologically, the paper shows that global curvature can be imposed on an EASI system by full-information concentrated GLS at trivial cost, resolving the regularity failures that typically undermine policy use of estimated demand systems. Substantively, monthly own-price elasticities are uniformly negative and larger than annual estimates, poorer households adjust most, and the incidence of the 2020–2022 price changes—dominated by the pork price reversal—was progressive, with net losses rising from roughly zero at the bottom of the income distribution to their largest at the top. The elasticity and welfare estimates provide direct inputs for the design of food price stabilization and targeted transfer policy in China.</w:t>
+        <w:t>We provide an externally priced monthly food purchase-demand system for urban China. The scanner panel is especially useful for separating purchase incidence from conditional basket allocation, but the same feature means that monthly zeroes should not be read mechanically as zero consumption. Substantively, own-price purchase elasticities are uniformly negative, poorer households adjust most, and storable goods require explicit purchase-cycle diagnostics. The exploratory incidence calculation for 2020-2022 shows how the pork price reversal can offset first-order food inflation exposure for lower-income households, but the policy-ready result is the purchase-elasticity structure; strict welfare analysis would require either a validated potential-consumption interpretation or an integrable corner-demand model.</w:t>
       </w:r>
     </w:p>
     <w:p>
@@ -4444,7 +4449,7 @@
           <w:rFonts w:ascii="Times New Roman" w:hAnsi="Times New Roman"/>
           <w:color w:val="000000"/>
         </w:rPr>
-        <w:t>Table 3. Expenditure and Marshallian own-price elasticities (curvature-constrained)</w:t>
+        <w:t>Table 3. Expenditure and Marshallian own-price purchase elasticities</w:t>
       </w:r>
     </w:p>
     <w:tbl>
@@ -5406,7 +5411,7 @@
           <w:i/>
           <w:sz w:val="16"/>
         </w:rPr>
-        <w:t>Notes: participation-adjusted elasticities; SEs and percentile CIs from a 210-replication household pairs cluster bootstrap over the full two-step constrained pipeline.</w:t>
+        <w:t>Notes: participation-adjusted monthly purchase elasticities; household bootstrap CIs are composition/two-step uncertainty checks. Province-level price-cluster diagnostics are reported in the audit appendix.</w:t>
       </w:r>
     </w:p>
     <w:p>
@@ -5418,7 +5423,7 @@
           <w:rFonts w:ascii="Times New Roman" w:hAnsi="Times New Roman"/>
           <w:color w:val="000000"/>
         </w:rPr>
-        <w:t>Table 4. Hicksian (compensated) price elasticity matrix</w:t>
+        <w:t>Table 4. Compensated price elasticity diagnostic matrix</w:t>
       </w:r>
     </w:p>
     <w:tbl>

</xml_diff>